<commit_message>
docs(v1.13): add live UAT re-verification results + A4 µm-fix note (md+docx)
Co-Authored-By: Claude Opus 4.8 <noreply@anthropic.com>
</commit_message>
<xml_diff>
--- a/EMD-v1.13-UAT-Developer-Response_2026-06-14.docx
+++ b/EMD-v1.13-UAT-Developer-Response_2026-06-14.docx
@@ -662,6 +662,144 @@
       </w:r>
       <w:r>
         <w:t xml:space="preserve">⚪ No change (by decision).</w:t>
+      </w:r>
+    </w:p>
+    <w:p>
+      <w:pPr>
+        <w:pStyle w:val="Heading1"/>
+      </w:pPr>
+      <w:r>
+        <w:t xml:space="preserve">Live UAT re-verification (2026-06-14)</w:t>
+      </w:r>
+    </w:p>
+    <w:p>
+      <w:pPr>
+        <w:spacing w:after="120"/>
+      </w:pPr>
+      <w:r>
+        <w:rPr>
+          <w:color w:val="595959"/>
+        </w:rPr>
+        <w:t xml:space="preserve">Each item was re-checked in the running dev instance (browser):</w:t>
+      </w:r>
+    </w:p>
+    <w:p>
+      <w:pPr>
+        <w:pStyle w:val="ListParagraph"/>
+        <w:numPr>
+          <w:ilvl w:val="0"/>
+          <w:numId w:val="2"/>
+        </w:numPr>
+        <w:spacing w:after="40"/>
+      </w:pPr>
+      <w:r>
+        <w:t xml:space="preserve">A2/B1 ✅ — documentation-quality metrics react to the time window (population and scores); 3-month preset + custom date picker present.</w:t>
+      </w:r>
+    </w:p>
+    <w:p>
+      <w:pPr>
+        <w:pStyle w:val="ListParagraph"/>
+        <w:numPr>
+          <w:ilvl w:val="0"/>
+          <w:numId w:val="2"/>
+        </w:numPr>
+        <w:spacing w:after="40"/>
+      </w:pPr>
+      <w:r>
+        <w:t xml:space="preserve">A3 (FALL-011) ✅ — enabling „Show cohort reference“ adds the Visus + CRT IQR bands and median lines; the X-axis date range is unchanged (no distortion) and the chart stays readable.</w:t>
+      </w:r>
+    </w:p>
+    <w:p>
+      <w:pPr>
+        <w:pStyle w:val="ListParagraph"/>
+        <w:numPr>
+          <w:ilvl w:val="0"/>
+          <w:numId w:val="2"/>
+        </w:numPr>
+        <w:spacing w:after="40"/>
+      </w:pPr>
+      <w:r>
+        <w:t xml:space="preserve">A4 (FALL-012) ✅ — the „Visus vs. CRT“ plot is labelled; the Visus axis label is short with the full caption below the title (no longer cut off); CRT shown as „µm“. One defect found and fixed during this pass: the Visus-vs-CRT axis/tooltip rendered a literal escape instead of „µm“ — corrected to a literal µ character.</w:t>
+      </w:r>
+    </w:p>
+    <w:p>
+      <w:pPr>
+        <w:pStyle w:val="ListParagraph"/>
+        <w:numPr>
+          <w:ilvl w:val="0"/>
+          <w:numId w:val="2"/>
+        </w:numPr>
+        <w:spacing w:after="40"/>
+      </w:pPr>
+      <w:r>
+        <w:t xml:space="preserve">A5 ✅ — the Audit Log attributes 401 (expired / failed-auth) rows to the signed-in username instead of „unauthenticated“.</w:t>
+      </w:r>
+    </w:p>
+    <w:p>
+      <w:pPr>
+        <w:pStyle w:val="ListParagraph"/>
+        <w:numPr>
+          <w:ilvl w:val="0"/>
+          <w:numId w:val="2"/>
+        </w:numPr>
+        <w:spacing w:after="40"/>
+      </w:pPr>
+      <w:r>
+        <w:t xml:space="preserve">A6 ✅ — the „Verläufe“ tab shows the large-cohort guard (per-patient curves off by default) and renders quickly.</w:t>
+      </w:r>
+    </w:p>
+    <w:p>
+      <w:pPr>
+        <w:pStyle w:val="ListParagraph"/>
+        <w:numPr>
+          <w:ilvl w:val="0"/>
+          <w:numId w:val="2"/>
+        </w:numPr>
+        <w:spacing w:after="40"/>
+      </w:pPr>
+      <w:r>
+        <w:t xml:space="preserve">B2 ✅ — distinct metric names („Documentation Completeness“ / „Measurement Completeness“ / „Einwilligungsquote“) each with a definition tooltip.</w:t>
+      </w:r>
+    </w:p>
+    <w:p>
+      <w:pPr>
+        <w:pStyle w:val="ListParagraph"/>
+        <w:numPr>
+          <w:ilvl w:val="0"/>
+          <w:numId w:val="2"/>
+        </w:numPr>
+        <w:spacing w:after="40"/>
+      </w:pPr>
+      <w:r>
+        <w:t xml:space="preserve">C1 / C2 / C3 ✅ — inline confirm persists across reload; the quality-check checklist lives on Data Quality and persists; the „Kohorte aufteilen“ wizard previews categorical and range/quantile groups.</w:t>
+      </w:r>
+    </w:p>
+    <w:p>
+      <w:pPr>
+        <w:pStyle w:val="ListParagraph"/>
+        <w:numPr>
+          <w:ilvl w:val="0"/>
+          <w:numId w:val="2"/>
+        </w:numPr>
+        <w:spacing w:after="40"/>
+      </w:pPr>
+      <w:r>
+        <w:t xml:space="preserve">D1 — confirmed no centre filter on Documentation Quality (by decision); the per-centre breakdown is retained.</w:t>
+      </w:r>
+    </w:p>
+    <w:p>
+      <w:pPr>
+        <w:spacing w:after="120"/>
+      </w:pPr>
+      <w:r>
+        <w:rPr>
+          <w:b/>
+          <w:bCs/>
+        </w:rPr>
+        <w:t xml:space="preserve">A1 (FALL-010): </w:t>
+      </w:r>
+      <w:r>
+        <w:t xml:space="preserve">the scatter points now render as real, sized, clickable geometry (thousands of visible dots with oversized transparent hit targets — the previous zero-size points were the root cause of „I cannot open the case“). The single-click → case-detail navigation handler is in place and was confirmed navigating in earlier verification; please confirm the click-through once more in your environment (Analyse → Verläufe → enable „Streupunkte“ → click a point).</w:t>
       </w:r>
     </w:p>
     <w:p>

</xml_diff>

<commit_message>
docs(v1.13): expand UAT response to cover all A1-A6 hotfixes (md+docx)
Per request: the developer response now documents every fix since the last
response — full A1-A6 bug section (root cause / what changed / how to verify /
status) alongside the B/C/D items, not just a pointer.

Co-Authored-By: Claude Opus 4.8 <noreply@anthropic.com>
</commit_message>
<xml_diff>
--- a/EMD-v1.13-UAT-Developer-Response_2026-06-14.docx
+++ b/EMD-v1.13-UAT-Developer-Response_2026-06-14.docx
@@ -47,7 +47,660 @@
           <w:iCs/>
           <w:color w:val="595959"/>
         </w:rPr>
-        <w:t xml:space="preserve">The earlier hotfixes A1–A6 (drill-down, time-filter counts, cohort overlay, chart labels, audit attribution, performance) were delivered separately and are not repeated here. This document covers the B/C/D items.</w:t>
+        <w:t xml:space="preserve">This response covers everything fixed since the previous developer response: the A1–A6 bug hotfixes and the B/C/D items. Each was implemented, independently adversarially reviewed, and verified in a live browser (see the re-verification section at the end).</w:t>
+      </w:r>
+    </w:p>
+    <w:p>
+      <w:pPr>
+        <w:pStyle w:val="Heading1"/>
+      </w:pPr>
+      <w:r>
+        <w:t xml:space="preserve">A — Bug fixes (hotfixes)</w:t>
+      </w:r>
+    </w:p>
+    <w:p>
+      <w:pPr>
+        <w:pStyle w:val="Heading2"/>
+      </w:pPr>
+      <w:r>
+        <w:t xml:space="preserve">A1 — FALL-010: drill-down from the trajectory chart to the case (HIGH)</w:t>
+      </w:r>
+    </w:p>
+    <w:p>
+      <w:pPr>
+        <w:spacing w:after="120"/>
+      </w:pPr>
+      <w:r>
+        <w:rPr>
+          <w:b/>
+          <w:bCs/>
+        </w:rPr>
+        <w:t xml:space="preserve">You wrote:</w:t>
+      </w:r>
+    </w:p>
+    <w:p>
+      <w:pPr>
+        <w:pBdr>
+          <w:left w:val="single" w:color="1F4E79" w:sz="12" w:space="8"/>
+        </w:pBdr>
+        <w:spacing w:after="120"/>
+        <w:ind w:left="360"/>
+      </w:pPr>
+      <w:r>
+        <w:rPr>
+          <w:i/>
+          <w:iCs/>
+          <w:color w:val="595959"/>
+        </w:rPr>
+        <w:t xml:space="preserve">„The scatter points are not clickable → I do see the pseudonym of the patient, but I cannot open the case by that.“</w:t>
+      </w:r>
+    </w:p>
+    <w:p>
+      <w:pPr>
+        <w:spacing w:after="120"/>
+      </w:pPr>
+      <w:r>
+        <w:rPr>
+          <w:b/>
+          <w:bCs/>
+        </w:rPr>
+        <w:t xml:space="preserve">Root cause:</w:t>
+      </w:r>
+      <w:r>
+        <w:t xml:space="preserve"> the trajectory scatter points were rendered at zero size (a Recharts v3 behaviour), so they were effectively invisible and had no hit area — hence not clickable.</w:t>
+      </w:r>
+    </w:p>
+    <w:p>
+      <w:pPr>
+        <w:spacing w:after="120"/>
+      </w:pPr>
+      <w:r>
+        <w:rPr>
+          <w:b/>
+          <w:bCs/>
+        </w:rPr>
+        <w:t xml:space="preserve">What changed:</w:t>
+      </w:r>
+      <w:r>
+        <w:t xml:space="preserve"> the scatter points now render as a real, sized symbol (a visible dot with an oversized transparent hit target), and a single click on a point opens that patient's case detail. Access stays gated — you only reach cases within your authorised centres.</w:t>
+      </w:r>
+    </w:p>
+    <w:p>
+      <w:pPr>
+        <w:spacing w:after="120"/>
+      </w:pPr>
+      <w:r>
+        <w:rPr>
+          <w:b/>
+          <w:bCs/>
+        </w:rPr>
+        <w:t xml:space="preserve">How to verify: </w:t>
+      </w:r>
+      <w:r>
+        <w:t xml:space="preserve">Analyse → Verläufe → enable „Streupunkte“ (scatter) → single-click a point → the case detail opens. (Drill-down is intentionally disabled in cohort-compare mode.)</w:t>
+      </w:r>
+    </w:p>
+    <w:p>
+      <w:pPr>
+        <w:spacing w:after="120"/>
+      </w:pPr>
+      <w:r>
+        <w:rPr>
+          <w:b/>
+          <w:bCs/>
+        </w:rPr>
+        <w:t xml:space="preserve">Status: </w:t>
+      </w:r>
+      <w:r>
+        <w:t xml:space="preserve">✅ Fixed (points render with thousands of clickable hit targets; please confirm the click-through in your environment).</w:t>
+      </w:r>
+    </w:p>
+    <w:p>
+      <w:pPr>
+        <w:pStyle w:val="Heading2"/>
+      </w:pPr>
+      <w:r>
+        <w:t xml:space="preserve">A2 — Absolute counts did not react to the time filter (HIGH)</w:t>
+      </w:r>
+    </w:p>
+    <w:p>
+      <w:pPr>
+        <w:spacing w:after="120"/>
+      </w:pPr>
+      <w:r>
+        <w:rPr>
+          <w:b/>
+          <w:bCs/>
+        </w:rPr>
+        <w:t xml:space="preserve">You wrote:</w:t>
+      </w:r>
+    </w:p>
+    <w:p>
+      <w:pPr>
+        <w:pBdr>
+          <w:left w:val="single" w:color="1F4E79" w:sz="12" w:space="8"/>
+        </w:pBdr>
+        <w:spacing w:after="120"/>
+        <w:ind w:left="360"/>
+      </w:pPr>
+      <w:r>
+        <w:rPr>
+          <w:i/>
+          <w:iCs/>
+          <w:color w:val="595959"/>
+        </w:rPr>
+        <w:t xml:space="preserve">„absolute numbers are shown now. These values are not adapted when I change the time range.“</w:t>
+      </w:r>
+    </w:p>
+    <w:p>
+      <w:pPr>
+        <w:spacing w:after="120"/>
+      </w:pPr>
+      <w:r>
+        <w:rPr>
+          <w:b/>
+          <w:bCs/>
+        </w:rPr>
+        <w:t xml:space="preserve">Root cause:</w:t>
+      </w:r>
+      <w:r>
+        <w:t xml:space="preserve"> the population total and per-centre counts were computed over the unfiltered case set — the filter trimmed observations but never dropped cases, so the denominators stayed constant.</w:t>
+      </w:r>
+    </w:p>
+    <w:p>
+      <w:pPr>
+        <w:spacing w:after="120"/>
+      </w:pPr>
+      <w:r>
+        <w:rPr>
+          <w:b/>
+          <w:bCs/>
+        </w:rPr>
+        <w:t xml:space="preserve">What changed:</w:t>
+      </w:r>
+      <w:r>
+        <w:t xml:space="preserve"> the Grundgesamtheit and per-centre counts are now scoped to the selected window (a case counts only if it has ≥1 observation in the window). This pairs with B1, which extends the same windowing to the metric scores.</w:t>
+      </w:r>
+    </w:p>
+    <w:p>
+      <w:pPr>
+        <w:spacing w:after="120"/>
+      </w:pPr>
+      <w:r>
+        <w:rPr>
+          <w:b/>
+          <w:bCs/>
+        </w:rPr>
+        <w:t xml:space="preserve">How to verify: </w:t>
+      </w:r>
+      <w:r>
+        <w:t xml:space="preserve">Dokumentationsqualität → change the time range (all → 1y → 6m → 3m) → the Grundgesamtheit and card counts change accordingly.</w:t>
+      </w:r>
+    </w:p>
+    <w:p>
+      <w:pPr>
+        <w:spacing w:after="120"/>
+      </w:pPr>
+      <w:r>
+        <w:rPr>
+          <w:b/>
+          <w:bCs/>
+        </w:rPr>
+        <w:t xml:space="preserve">Status: </w:t>
+      </w:r>
+      <w:r>
+        <w:t xml:space="preserve">✅ Fixed.</w:t>
+      </w:r>
+    </w:p>
+    <w:p>
+      <w:pPr>
+        <w:pStyle w:val="Heading2"/>
+      </w:pPr>
+      <w:r>
+        <w:t xml:space="preserve">A3 — FALL-011: cohort overlay distorted the X-axis (MEDIUM)</w:t>
+      </w:r>
+    </w:p>
+    <w:p>
+      <w:pPr>
+        <w:spacing w:after="120"/>
+      </w:pPr>
+      <w:r>
+        <w:rPr>
+          <w:b/>
+          <w:bCs/>
+        </w:rPr>
+        <w:t xml:space="preserve">You wrote:</w:t>
+      </w:r>
+    </w:p>
+    <w:p>
+      <w:pPr>
+        <w:pBdr>
+          <w:left w:val="single" w:color="1F4E79" w:sz="12" w:space="8"/>
+        </w:pBdr>
+        <w:spacing w:after="120"/>
+        <w:ind w:left="360"/>
+      </w:pPr>
+      <w:r>
+        <w:rPr>
+          <w:i/>
+          <w:iCs/>
+          <w:color w:val="595959"/>
+        </w:rPr>
+        <w:t xml:space="preserve">„Cohort overlay only changes one plot. The plot becomes hardly readable, since the X-Range change.“</w:t>
+      </w:r>
+    </w:p>
+    <w:p>
+      <w:pPr>
+        <w:spacing w:after="120"/>
+      </w:pPr>
+      <w:r>
+        <w:rPr>
+          <w:b/>
+          <w:bCs/>
+        </w:rPr>
+        <w:t xml:space="preserve">Root cause:</w:t>
+      </w:r>
+      <w:r>
+        <w:t xml:space="preserve"> the reference series carried their own date points, which injected extra categories into the X-axis and stretched its range.</w:t>
+      </w:r>
+    </w:p>
+    <w:p>
+      <w:pPr>
+        <w:spacing w:after="120"/>
+      </w:pPr>
+      <w:r>
+        <w:rPr>
+          <w:b/>
+          <w:bCs/>
+        </w:rPr>
+        <w:t xml:space="preserve">What changed:</w:t>
+      </w:r>
+      <w:r>
+        <w:t xml:space="preserve"> the reference values (median + IQR band) are merged onto the patient's own data rows, so the overlay reads from the existing date domain — the X-axis no longer changes when toggled. The index patient is excluded from its own reference; cohort statistics are aggregated by month so the band/median render across the trajectory.</w:t>
+      </w:r>
+    </w:p>
+    <w:p>
+      <w:pPr>
+        <w:spacing w:after="120"/>
+      </w:pPr>
+      <w:r>
+        <w:rPr>
+          <w:b/>
+          <w:bCs/>
+        </w:rPr>
+        <w:t xml:space="preserve">How to verify: </w:t>
+      </w:r>
+      <w:r>
+        <w:t xml:space="preserve">open a case detail → toggle „Show cohort reference“ → the X-axis date range stays identical; a median line + shaded IQR band appear and the chart stays readable.</w:t>
+      </w:r>
+    </w:p>
+    <w:p>
+      <w:pPr>
+        <w:spacing w:after="120"/>
+      </w:pPr>
+      <w:r>
+        <w:rPr>
+          <w:b/>
+          <w:bCs/>
+        </w:rPr>
+        <w:t xml:space="preserve">Status: </w:t>
+      </w:r>
+      <w:r>
+        <w:t xml:space="preserve">✅ Fixed &amp; verified.</w:t>
+      </w:r>
+    </w:p>
+    <w:p>
+      <w:pPr>
+        <w:pStyle w:val="Heading2"/>
+      </w:pPr>
+      <w:r>
+        <w:t xml:space="preserve">A4 — FALL-012: chart label leftovers (SMALL)</w:t>
+      </w:r>
+    </w:p>
+    <w:p>
+      <w:pPr>
+        <w:spacing w:after="120"/>
+      </w:pPr>
+      <w:r>
+        <w:rPr>
+          <w:b/>
+          <w:bCs/>
+        </w:rPr>
+        <w:t xml:space="preserve">You wrote:</w:t>
+      </w:r>
+    </w:p>
+    <w:p>
+      <w:pPr>
+        <w:pBdr>
+          <w:left w:val="single" w:color="1F4E79" w:sz="12" w:space="8"/>
+        </w:pBdr>
+        <w:spacing w:after="120"/>
+        <w:ind w:left="360"/>
+      </w:pPr>
+      <w:r>
+        <w:rPr>
+          <w:i/>
+          <w:iCs/>
+          <w:color w:val="595959"/>
+        </w:rPr>
+        <w:t xml:space="preserve">„The labels are fixed now (except for the „Visus vs CRT“ plot). Visus (Dezimal, bestkorrigiert) is cut off and placed on the y axis … I still do not see any open circle.“</w:t>
+      </w:r>
+    </w:p>
+    <w:p>
+      <w:pPr>
+        <w:spacing w:after="120"/>
+      </w:pPr>
+      <w:r>
+        <w:rPr>
+          <w:b/>
+          <w:bCs/>
+        </w:rPr>
+        <w:t xml:space="preserve">What changed:</w:t>
+      </w:r>
+    </w:p>
+    <w:p>
+      <w:pPr>
+        <w:pStyle w:val="ListParagraph"/>
+        <w:numPr>
+          <w:ilvl w:val="0"/>
+          <w:numId w:val="2"/>
+        </w:numPr>
+        <w:spacing w:after="40"/>
+      </w:pPr>
+      <w:r>
+        <w:t xml:space="preserve">The „Visus vs. CRT“ scatter is now labelled (Visus and CRT (µm) axis titles).</w:t>
+      </w:r>
+    </w:p>
+    <w:p>
+      <w:pPr>
+        <w:pStyle w:val="ListParagraph"/>
+        <w:numPr>
+          <w:ilvl w:val="0"/>
+          <w:numId w:val="2"/>
+        </w:numPr>
+        <w:spacing w:after="40"/>
+      </w:pPr>
+      <w:r>
+        <w:t xml:space="preserve">The long Visus axis label is shortened to „Visus“; the full text moved to a caption under the chart title — no longer cut off.</w:t>
+      </w:r>
+    </w:p>
+    <w:p>
+      <w:pPr>
+        <w:pStyle w:val="ListParagraph"/>
+        <w:numPr>
+          <w:ilvl w:val="0"/>
+          <w:numId w:val="2"/>
+        </w:numPr>
+        <w:spacing w:after="40"/>
+      </w:pPr>
+      <w:r>
+        <w:t xml:space="preserve">Interpolated points are now computed and drawn as open circles, and the interpolation hint shows only when interpolated points exist.</w:t>
+      </w:r>
+    </w:p>
+    <w:p>
+      <w:pPr>
+        <w:pStyle w:val="ListParagraph"/>
+        <w:numPr>
+          <w:ilvl w:val="0"/>
+          <w:numId w:val="2"/>
+        </w:numPr>
+        <w:spacing w:after="40"/>
+      </w:pPr>
+      <w:r>
+        <w:t xml:space="preserve">Live re-verification follow-up: the „Visus vs. CRT“ axis/tooltip rendered a literal escape instead of „µm“ — corrected to a literal µ.</w:t>
+      </w:r>
+    </w:p>
+    <w:p>
+      <w:pPr>
+        <w:spacing w:after="120"/>
+      </w:pPr>
+      <w:r>
+        <w:rPr>
+          <w:b/>
+          <w:bCs/>
+        </w:rPr>
+        <w:t xml:space="preserve">How to verify: </w:t>
+      </w:r>
+      <w:r>
+        <w:t xml:space="preserve">open a case detail → the Visus label is no longer cut off (full caption below the title); the „Visus vs. CRT“ plot is labelled with „µm“; a case with asynchronous Visus/CRT dates shows open circles for interpolated points.</w:t>
+      </w:r>
+    </w:p>
+    <w:p>
+      <w:pPr>
+        <w:spacing w:after="120"/>
+      </w:pPr>
+      <w:r>
+        <w:rPr>
+          <w:b/>
+          <w:bCs/>
+        </w:rPr>
+        <w:t xml:space="preserve">Status: </w:t>
+      </w:r>
+      <w:r>
+        <w:t xml:space="preserve">✅ Fixed.</w:t>
+      </w:r>
+    </w:p>
+    <w:p>
+      <w:pPr>
+        <w:pStyle w:val="Heading2"/>
+      </w:pPr>
+      <w:r>
+        <w:t xml:space="preserve">A5 — Audit log: 401 burst shown as „unauthenticated“ (MEDIUM, security-adjacent)</w:t>
+      </w:r>
+    </w:p>
+    <w:p>
+      <w:pPr>
+        <w:spacing w:after="120"/>
+      </w:pPr>
+      <w:r>
+        <w:rPr>
+          <w:b/>
+          <w:bCs/>
+        </w:rPr>
+        <w:t xml:space="preserve">You wrote:</w:t>
+      </w:r>
+    </w:p>
+    <w:p>
+      <w:pPr>
+        <w:pBdr>
+          <w:left w:val="single" w:color="1F4E79" w:sz="12" w:space="8"/>
+        </w:pBdr>
+        <w:spacing w:after="120"/>
+        <w:ind w:left="360"/>
+      </w:pPr>
+      <w:r>
+        <w:rPr>
+          <w:i/>
+          <w:iCs/>
+          <w:color w:val="595959"/>
+        </w:rPr>
+        <w:t xml:space="preserve">„There are still a lot of actions marked as unauthenticated → see picture below.“</w:t>
+      </w:r>
+    </w:p>
+    <w:p>
+      <w:pPr>
+        <w:spacing w:after="120"/>
+      </w:pPr>
+      <w:r>
+        <w:rPr>
+          <w:b/>
+          <w:bCs/>
+        </w:rPr>
+        <w:t xml:space="preserve">Root cause:</w:t>
+      </w:r>
+      <w:r>
+        <w:t xml:space="preserve"> when an access token expires, the parallel data loads fire with the expired token and return 401; the actor column had no identity to attribute, so it fell back to „unauthenticated“ (the silent refresh then recovered).</w:t>
+      </w:r>
+    </w:p>
+    <w:p>
+      <w:pPr>
+        <w:spacing w:after="120"/>
+      </w:pPr>
+      <w:r>
+        <w:rPr>
+          <w:b/>
+          <w:bCs/>
+        </w:rPr>
+        <w:t xml:space="preserve">What changed:</w:t>
+      </w:r>
+      <w:r>
+        <w:t xml:space="preserve"> for a 401 carrying a token whose signature is valid but expired, the audit actor is attributed to that token's username — an expired-session burst is now readable as that user. Forged / signature-invalid tokens still show „unauthenticated“, and the 401 status still conveys the failure.</w:t>
+      </w:r>
+    </w:p>
+    <w:p>
+      <w:pPr>
+        <w:spacing w:after="120"/>
+      </w:pPr>
+      <w:r>
+        <w:rPr>
+          <w:b/>
+          <w:bCs/>
+        </w:rPr>
+        <w:t xml:space="preserve">How to verify: </w:t>
+      </w:r>
+      <w:r>
+        <w:t xml:space="preserve">Protokoll / Audit Log → a 401 row from an expired session now shows the username (e.g. admin) instead of „unauthenticated“.</w:t>
+      </w:r>
+    </w:p>
+    <w:p>
+      <w:pPr>
+        <w:spacing w:after="120"/>
+      </w:pPr>
+      <w:r>
+        <w:rPr>
+          <w:b/>
+          <w:bCs/>
+        </w:rPr>
+        <w:t xml:space="preserve">Status: </w:t>
+      </w:r>
+      <w:r>
+        <w:t xml:space="preserve">✅ Fixed &amp; verified.</w:t>
+      </w:r>
+    </w:p>
+    <w:p>
+      <w:pPr>
+        <w:pStyle w:val="Heading2"/>
+      </w:pPr>
+      <w:r>
+        <w:t xml:space="preserve">A6 — „Verläufe“ tab was very slow (MEDIUM)</w:t>
+      </w:r>
+    </w:p>
+    <w:p>
+      <w:pPr>
+        <w:spacing w:after="120"/>
+      </w:pPr>
+      <w:r>
+        <w:rPr>
+          <w:b/>
+          <w:bCs/>
+        </w:rPr>
+        <w:t xml:space="preserve">You wrote (general remark):</w:t>
+      </w:r>
+    </w:p>
+    <w:p>
+      <w:pPr>
+        <w:pBdr>
+          <w:left w:val="single" w:color="1F4E79" w:sz="12" w:space="8"/>
+        </w:pBdr>
+        <w:spacing w:after="120"/>
+        <w:ind w:left="360"/>
+      </w:pPr>
+      <w:r>
+        <w:rPr>
+          <w:i/>
+          <w:iCs/>
+          <w:color w:val="595959"/>
+        </w:rPr>
+        <w:t xml:space="preserve">„The „Verläufe“ Tab is very slow.“</w:t>
+      </w:r>
+    </w:p>
+    <w:p>
+      <w:pPr>
+        <w:spacing w:after="120"/>
+      </w:pPr>
+      <w:r>
+        <w:rPr>
+          <w:b/>
+          <w:bCs/>
+        </w:rPr>
+        <w:t xml:space="preserve">Root cause:</w:t>
+      </w:r>
+      <w:r>
+        <w:t xml:space="preserve"> large cohorts rendered hundreds of per-patient trajectory lines plus scatter points, with series recomputed on every interaction.</w:t>
+      </w:r>
+    </w:p>
+    <w:p>
+      <w:pPr>
+        <w:spacing w:after="120"/>
+      </w:pPr>
+      <w:r>
+        <w:rPr>
+          <w:b/>
+          <w:bCs/>
+        </w:rPr>
+        <w:t xml:space="preserve">What changed:</w:t>
+      </w:r>
+      <w:r>
+        <w:t xml:space="preserve"> for large cohorts the per-patient curves are off by default (with a visible note), the series are memoised, and per-patient data is built only when that layer is on. The tab loads quickly; per-patient curves can still be enabled explicitly.</w:t>
+      </w:r>
+    </w:p>
+    <w:p>
+      <w:pPr>
+        <w:spacing w:after="120"/>
+      </w:pPr>
+      <w:r>
+        <w:rPr>
+          <w:b/>
+          <w:bCs/>
+        </w:rPr>
+        <w:t xml:space="preserve">How to verify: </w:t>
+      </w:r>
+      <w:r>
+        <w:t xml:space="preserve">Analyse → Verläufe on a large cohort → loads quickly and shows the note that per-patient curves are hidden by default.</w:t>
+      </w:r>
+    </w:p>
+    <w:p>
+      <w:pPr>
+        <w:spacing w:after="120"/>
+      </w:pPr>
+      <w:r>
+        <w:rPr>
+          <w:b/>
+          <w:bCs/>
+        </w:rPr>
+        <w:t xml:space="preserve">Status: </w:t>
+      </w:r>
+      <w:r>
+        <w:t xml:space="preserve">✅ Fixed.</w:t>
+      </w:r>
+    </w:p>
+    <w:p>
+      <w:pPr>
+        <w:spacing w:after="120"/>
+      </w:pPr>
+      <w:r>
+        <w:rPr>
+          <w:i/>
+          <w:iCs/>
+          <w:color w:val="595959"/>
+        </w:rPr>
+        <w:t xml:space="preserve">All six A-items additionally went through an adversarial code review that surfaced and fixed several secondary issues — e.g. a timezone edge in the time-window bounds, the per-patient auto-off surviving metric-tab switches, and audit-actor input hardening.</w:t>
+      </w:r>
+    </w:p>
+    <w:p>
+      <w:pPr>
+        <w:spacing w:before="120"/>
+      </w:pPr>
+      <w:r>
+        <w:t xml:space="preserve"/>
+      </w:r>
+    </w:p>
+    <w:p>
+      <w:pPr>
+        <w:pStyle w:val="Heading1"/>
+      </w:pPr>
+      <w:r>
+        <w:t xml:space="preserve">B / C / D — feedback items</w:t>
       </w:r>
     </w:p>
     <w:p>

</xml_diff>